<commit_message>
Update to SIT submission
</commit_message>
<xml_diff>
--- a/SIT submission/2401326_ErnestSim_CapstoneProposal.docx
+++ b/SIT submission/2401326_ErnestSim_CapstoneProposal.docx
@@ -13,7 +13,28 @@
           <w:b/>
           <w:sz w:val="22"/>
         </w:rPr>
-        <w:t>SINGAPORE INSTITUTE OF TECHNOLOGY  |  UNIVERSITY OF GLASGOW</w:t>
+        <w:t xml:space="preserve">SINGAPORE INSTITUTE OF </w:t>
+      </w:r>
+      <w:r>
+        <w:rPr>
+          <w:b/>
+          <w:sz w:val="22"/>
+        </w:rPr>
+        <w:t xml:space="preserve">TECHNOLOGY </w:t>
+      </w:r>
+      <w:r>
+        <w:rPr>
+          <w:b/>
+          <w:sz w:val="22"/>
+        </w:rPr>
+        <w:t>| UNIVERSITY</w:t>
+      </w:r>
+      <w:r>
+        <w:rPr>
+          <w:b/>
+          <w:sz w:val="22"/>
+        </w:rPr>
+        <w:t xml:space="preserve"> OF GLASGOW</w:t>
       </w:r>
     </w:p>
     <w:p>
@@ -141,7 +162,33 @@
         <w:rPr>
           <w:sz w:val="22"/>
         </w:rPr>
-        <w:t>19 October 2026  |  5:00 pm</w:t>
+        <w:t xml:space="preserve">19 October </w:t>
+      </w:r>
+      <w:r>
+        <w:rPr>
+          <w:sz w:val="22"/>
+        </w:rPr>
+        <w:t xml:space="preserve">2026 </w:t>
+      </w:r>
+      <w:proofErr w:type="gramStart"/>
+      <w:r>
+        <w:rPr>
+          <w:sz w:val="22"/>
+        </w:rPr>
+        <w:t>|</w:t>
+      </w:r>
+      <w:r>
+        <w:rPr>
+          <w:sz w:val="22"/>
+        </w:rPr>
+        <w:t xml:space="preserve">  5:00</w:t>
+      </w:r>
+      <w:proofErr w:type="gramEnd"/>
+      <w:r>
+        <w:rPr>
+          <w:sz w:val="22"/>
+        </w:rPr>
+        <w:t xml:space="preserve"> pm</w:t>
       </w:r>
     </w:p>
     <w:p>
@@ -401,7 +448,23 @@
           <w:color w:val="191919"/>
           <w:sz w:val="20"/>
         </w:rPr>
-        <w:t>Develop a process-data and Yamazumi module to record manual and automatic times, show operator workloads and support line balancing.</w:t>
+        <w:t xml:space="preserve">Develop </w:t>
+      </w:r>
+      <w:r>
+        <w:rPr>
+          <w:rFonts w:ascii="Arial" w:hAnsi="Arial"/>
+          <w:color w:val="191919"/>
+          <w:sz w:val="20"/>
+        </w:rPr>
+        <w:t xml:space="preserve">process </w:t>
+      </w:r>
+      <w:r>
+        <w:rPr>
+          <w:rFonts w:ascii="Arial" w:hAnsi="Arial"/>
+          <w:color w:val="191919"/>
+          <w:sz w:val="20"/>
+        </w:rPr>
+        <w:t>data and Yamazumi module to record manual and automatic times, show operator workloads and support line balancing.</w:t>
       </w:r>
     </w:p>
     <w:p>
@@ -417,7 +480,23 @@
           <w:color w:val="191919"/>
           <w:sz w:val="20"/>
         </w:rPr>
-        <w:t>Build an interactive line layout tool in which users can assign processes to stations, position operators and compare alternative arrangements.</w:t>
+        <w:t xml:space="preserve">Build an interactive line layout tool in which users can assign processes to </w:t>
+      </w:r>
+      <w:r>
+        <w:rPr>
+          <w:rFonts w:ascii="Arial" w:hAnsi="Arial"/>
+          <w:color w:val="191919"/>
+          <w:sz w:val="20"/>
+        </w:rPr>
+        <w:t>stations and</w:t>
+      </w:r>
+      <w:r>
+        <w:rPr>
+          <w:rFonts w:ascii="Arial" w:hAnsi="Arial"/>
+          <w:color w:val="191919"/>
+          <w:sz w:val="20"/>
+        </w:rPr>
+        <w:t xml:space="preserve"> position operators and compare alternative arrangements.</w:t>
       </w:r>
     </w:p>
     <w:p>
@@ -895,7 +974,15 @@
         <w:spacing w:line="269" w:lineRule="auto"/>
       </w:pPr>
       <w:r>
-        <w:t>The core project will focus on line planning and workflow simulation. Detailed modelling of rework, scrap rates and optimisation of batch quantities may be considered later if time and suitable data are available. The prototype will not control equipment or make final operational decisions.</w:t>
+        <w:t xml:space="preserve">The core project will focus </w:t>
+      </w:r>
+      <w:proofErr w:type="gramStart"/>
+      <w:r>
+        <w:t>on line</w:t>
+      </w:r>
+      <w:proofErr w:type="gramEnd"/>
+      <w:r>
+        <w:t xml:space="preserve"> planning and workflow simulation. Detailed modelling of rework, scrap rates and optimisation of batch quantities may be considered later if time and suitable data are available. The prototype will not control equipment or make final operational decisions.</w:t>
       </w:r>
     </w:p>
     <w:p>
@@ -918,7 +1005,13 @@
         <w:spacing w:line="269" w:lineRule="auto"/>
       </w:pPr>
       <w:r>
-        <w:t>I will use at least one representative production workflow and compare two or more line scenarios. The assessment will cover (i) whether calculated cycle times and bottlenecks are reasonable, (ii) whether the simulation is consistent with observed production data, and (iii) whether the time needed to prepare or revise a plan is reduced. If suitable industrial data cannot be shared, the same method will be demonstrated with clearly identified representative data, with that limitation stated.</w:t>
+        <w:t xml:space="preserve">I will use at least one representative production workflow and compare </w:t>
+      </w:r>
+      <w:r>
+        <w:t>two or more-line</w:t>
+      </w:r>
+      <w:r>
+        <w:t xml:space="preserve"> scenarios. The assessment will cover (i) whether calculated cycle times and bottlenecks are reasonable, (ii) whether the simulation is consistent with observed production data, and (iii) whether the time needed to prepare or revise a plan is reduced. If suitable industrial data cannot be shared, the same method will be demonstrated with clearly identified representative data, with that limitation stated.</w:t>
       </w:r>
     </w:p>
     <w:p>
@@ -1542,7 +1635,14 @@
           <w:rFonts w:ascii="Arial" w:hAnsi="Arial"/>
           <w:sz w:val="21"/>
         </w:rPr>
-        <w:t>starting from Start of Capstone trimester</w:t>
+        <w:t xml:space="preserve">starting from </w:t>
+      </w:r>
+      <w:r>
+        <w:rPr>
+          <w:rFonts w:ascii="Arial" w:hAnsi="Arial"/>
+          <w:sz w:val="21"/>
+        </w:rPr>
+        <w:t>Year 3 Trimester 2 week 1</w:t>
       </w:r>
       <w:r>
         <w:rPr>
@@ -5524,7 +5624,28 @@
         <w:spacing w:line="269" w:lineRule="auto"/>
       </w:pPr>
       <w:r>
-        <w:t>As this is mainly a computer-based project, the main risks are incorrect data, unreliable model outputs, handling of company information and delays caused by trying to develop too many features. Site safety risks may also arise if I collect or verify data on the shop floor. I have used a simple preliminary 5 × 5 matrix below; the final assessment should follow the school or company method if one is prescribed.</w:t>
+        <w:t xml:space="preserve">As the main </w:t>
+      </w:r>
+      <w:r>
+        <w:t>project</w:t>
+      </w:r>
+      <w:r>
+        <w:t xml:space="preserve"> involves software development and simulation on a computer, the direct Workplace Safety and Health (WSH) risks are expected to be low. The tool will be used to review possible line configurations; it will not control machinery or </w:t>
+      </w:r>
+      <w:r>
+        <w:t>authorize</w:t>
+      </w:r>
+      <w:r>
+        <w:t xml:space="preserve"> changes to the production line. Incorrect process data could affect the credibility of the </w:t>
+      </w:r>
+      <w:r>
+        <w:t>study but</w:t>
+      </w:r>
+      <w:r>
+        <w:t xml:space="preserve"> would not by itself create a physical safety hazard within the project scope. I have therefore assessed workplace hazards separately from technical and project-related </w:t>
+      </w:r>
+      <w:r>
+        <w:t>concerns.</w:t>
       </w:r>
     </w:p>
     <w:p>
@@ -5774,9 +5895,11 @@
             </w:pPr>
             <w:r>
               <w:rPr>
+                <w:rFonts w:cs="Arial"/>
                 <w:sz w:val="15"/>
+                <w:szCs w:val="15"/>
               </w:rPr>
-              <w:t>Wrong cycle-time or route data</w:t>
+              <w:t>Extended computer use</w:t>
             </w:r>
           </w:p>
         </w:tc>
@@ -5804,9 +5927,11 @@
             </w:pPr>
             <w:r>
               <w:rPr>
+                <w:rFonts w:cs="Arial"/>
                 <w:sz w:val="15"/>
+                <w:szCs w:val="15"/>
               </w:rPr>
-              <w:t>Simulation gives misleading results.</w:t>
+              <w:t>Eyestrain, fatigue or minor discomfort.</w:t>
             </w:r>
           </w:p>
         </w:tc>
@@ -5834,9 +5959,11 @@
             </w:pPr>
             <w:r>
               <w:rPr>
+                <w:rFonts w:cs="Arial"/>
                 <w:sz w:val="15"/>
+                <w:szCs w:val="15"/>
               </w:rPr>
-              <w:t>4×4=16</w:t>
+              <w:t>2×2=4 (Low)</w:t>
             </w:r>
           </w:p>
         </w:tc>
@@ -5864,9 +5991,11 @@
             </w:pPr>
             <w:r>
               <w:rPr>
+                <w:rFonts w:cs="Arial"/>
                 <w:sz w:val="15"/>
+                <w:szCs w:val="15"/>
               </w:rPr>
-              <w:t>Check entries with SWS, sample observations and input rules.</w:t>
+              <w:t>Use a suitable workstation and take regular breaks.</w:t>
             </w:r>
           </w:p>
         </w:tc>
@@ -5894,9 +6023,11 @@
             </w:pPr>
             <w:r>
               <w:rPr>
+                <w:rFonts w:cs="Arial"/>
                 <w:sz w:val="15"/>
+                <w:szCs w:val="15"/>
               </w:rPr>
-              <w:t>2×4=8</w:t>
+              <w:t>1×2=2 (Low)</w:t>
             </w:r>
           </w:p>
         </w:tc>
@@ -5927,11 +6058,23 @@
               <w:spacing w:after="0" w:line="252" w:lineRule="auto"/>
               <w:jc w:val="left"/>
             </w:pPr>
+            <w:proofErr w:type="gramStart"/>
             <w:r>
               <w:rPr>
+                <w:rFonts w:cs="Arial"/>
                 <w:sz w:val="15"/>
+                <w:szCs w:val="15"/>
               </w:rPr>
-              <w:t>Logic or programming errors</w:t>
+              <w:t>Loose</w:t>
+            </w:r>
+            <w:proofErr w:type="gramEnd"/>
+            <w:r>
+              <w:rPr>
+                <w:rFonts w:cs="Arial"/>
+                <w:sz w:val="15"/>
+                <w:szCs w:val="15"/>
+              </w:rPr>
+              <w:t xml:space="preserve"> cables or equipment at workstation</w:t>
             </w:r>
           </w:p>
         </w:tc>
@@ -5959,9 +6102,11 @@
             </w:pPr>
             <w:r>
               <w:rPr>
+                <w:rFonts w:cs="Arial"/>
                 <w:sz w:val="15"/>
+                <w:szCs w:val="15"/>
               </w:rPr>
-              <w:t>Incorrect bottleneck or workload conclusions.</w:t>
+              <w:t>Trips, minor injury or electrical exposure.</w:t>
             </w:r>
           </w:p>
         </w:tc>
@@ -5989,9 +6134,11 @@
             </w:pPr>
             <w:r>
               <w:rPr>
+                <w:rFonts w:cs="Arial"/>
                 <w:sz w:val="15"/>
+                <w:szCs w:val="15"/>
               </w:rPr>
-              <w:t>3×4=12</w:t>
+              <w:t>2×2=4 (Low)</w:t>
             </w:r>
           </w:p>
         </w:tc>
@@ -6019,9 +6166,11 @@
             </w:pPr>
             <w:r>
               <w:rPr>
+                <w:rFonts w:cs="Arial"/>
                 <w:sz w:val="15"/>
+                <w:szCs w:val="15"/>
               </w:rPr>
-              <w:t>Unit-test calculations; compare simple cases by hand.</w:t>
+              <w:t>Keep cables tidy; use approved, undamaged equipment.</w:t>
             </w:r>
           </w:p>
         </w:tc>
@@ -6049,9 +6198,11 @@
             </w:pPr>
             <w:r>
               <w:rPr>
+                <w:rFonts w:cs="Arial"/>
                 <w:sz w:val="15"/>
+                <w:szCs w:val="15"/>
               </w:rPr>
-              <w:t>1×4=4</w:t>
+              <w:t>1×2=2 (Low)</w:t>
             </w:r>
           </w:p>
         </w:tc>
@@ -6084,9 +6235,11 @@
             </w:pPr>
             <w:r>
               <w:rPr>
+                <w:rFonts w:cs="Arial"/>
                 <w:sz w:val="15"/>
+                <w:szCs w:val="15"/>
               </w:rPr>
-              <w:t>Confidential company information</w:t>
+              <w:t>Shop-floor observation (only if required)</w:t>
             </w:r>
           </w:p>
         </w:tc>
@@ -6114,9 +6267,11 @@
             </w:pPr>
             <w:r>
               <w:rPr>
+                <w:rFonts w:cs="Arial"/>
                 <w:sz w:val="15"/>
+                <w:szCs w:val="15"/>
               </w:rPr>
-              <w:t>Unauthorised disclosure or data loss.</w:t>
+              <w:t>Contact with moving equipment or materials.</w:t>
             </w:r>
           </w:p>
         </w:tc>
@@ -6144,9 +6299,11 @@
             </w:pPr>
             <w:r>
               <w:rPr>
+                <w:rFonts w:cs="Arial"/>
                 <w:sz w:val="15"/>
+                <w:szCs w:val="15"/>
               </w:rPr>
-              <w:t>3×4=12</w:t>
+              <w:t>2×4=8 (Medium)</w:t>
             </w:r>
           </w:p>
         </w:tc>
@@ -6174,9 +6331,11 @@
             </w:pPr>
             <w:r>
               <w:rPr>
+                <w:rFonts w:cs="Arial"/>
                 <w:sz w:val="15"/>
+                <w:szCs w:val="15"/>
               </w:rPr>
-              <w:t>Obtain approval; use anonymised data and private storage.</w:t>
+              <w:t>Seek site approval; follow existing RA, PPE rules and designated safe zones.</w:t>
             </w:r>
           </w:p>
         </w:tc>
@@ -6204,647 +6363,24 @@
             </w:pPr>
             <w:r>
               <w:rPr>
+                <w:rFonts w:cs="Arial"/>
                 <w:sz w:val="15"/>
+                <w:szCs w:val="15"/>
               </w:rPr>
-              <w:t>1×4=4</w:t>
+              <w:t>1×4=4 (Low</w:t>
             </w:r>
-          </w:p>
-        </w:tc>
-      </w:tr>
-      <w:tr>
-        <w:trPr>
-          <w:jc w:val="center"/>
-        </w:trPr>
-        <w:tc>
-          <w:tcPr>
-            <w:tcW w:w="1701" w:type="dxa"/>
-            <w:tcBorders>
-              <w:top w:val="single" w:sz="4" w:space="0" w:color="BABABA"/>
-              <w:left w:val="single" w:sz="4" w:space="0" w:color="BABABA"/>
-              <w:bottom w:val="single" w:sz="4" w:space="0" w:color="BABABA"/>
-              <w:right w:val="single" w:sz="4" w:space="0" w:color="BABABA"/>
-            </w:tcBorders>
-            <w:tcMar>
-              <w:top w:w="72" w:type="dxa"/>
-              <w:left w:w="70" w:type="dxa"/>
-              <w:bottom w:w="72" w:type="dxa"/>
-              <w:right w:w="65" w:type="dxa"/>
-            </w:tcMar>
-            <w:vAlign w:val="center"/>
-          </w:tcPr>
-          <w:p>
-            <w:pPr>
-              <w:spacing w:after="0" w:line="252" w:lineRule="auto"/>
-              <w:jc w:val="left"/>
-            </w:pPr>
             <w:r>
               <w:rPr>
+                <w:rFonts w:cs="Arial"/>
                 <w:sz w:val="15"/>
+                <w:szCs w:val="15"/>
               </w:rPr>
-              <w:t>Uncritical use of model results</w:t>
-            </w:r>
-          </w:p>
-        </w:tc>
-        <w:tc>
-          <w:tcPr>
-            <w:tcW w:w="1984" w:type="dxa"/>
-            <w:tcBorders>
-              <w:top w:val="single" w:sz="4" w:space="0" w:color="BABABA"/>
-              <w:left w:val="single" w:sz="4" w:space="0" w:color="BABABA"/>
-              <w:bottom w:val="single" w:sz="4" w:space="0" w:color="BABABA"/>
-              <w:right w:val="single" w:sz="4" w:space="0" w:color="BABABA"/>
-            </w:tcBorders>
-            <w:tcMar>
-              <w:top w:w="72" w:type="dxa"/>
-              <w:left w:w="70" w:type="dxa"/>
-              <w:bottom w:w="72" w:type="dxa"/>
-              <w:right w:w="65" w:type="dxa"/>
-            </w:tcMar>
-            <w:vAlign w:val="center"/>
-          </w:tcPr>
-          <w:p>
-            <w:pPr>
-              <w:spacing w:after="0" w:line="252" w:lineRule="auto"/>
-              <w:jc w:val="left"/>
-            </w:pPr>
-            <w:r>
-              <w:rPr>
-                <w:sz w:val="15"/>
-              </w:rPr>
-              <w:t>Unsafe or impractical implementation.</w:t>
-            </w:r>
-          </w:p>
-        </w:tc>
-        <w:tc>
-          <w:tcPr>
-            <w:tcW w:w="1162" w:type="dxa"/>
-            <w:tcBorders>
-              <w:top w:val="single" w:sz="4" w:space="0" w:color="BABABA"/>
-              <w:left w:val="single" w:sz="4" w:space="0" w:color="BABABA"/>
-              <w:bottom w:val="single" w:sz="4" w:space="0" w:color="BABABA"/>
-              <w:right w:val="single" w:sz="4" w:space="0" w:color="BABABA"/>
-            </w:tcBorders>
-            <w:tcMar>
-              <w:top w:w="72" w:type="dxa"/>
-              <w:left w:w="70" w:type="dxa"/>
-              <w:bottom w:w="72" w:type="dxa"/>
-              <w:right w:w="65" w:type="dxa"/>
-            </w:tcMar>
-            <w:vAlign w:val="center"/>
-          </w:tcPr>
-          <w:p>
-            <w:pPr>
-              <w:spacing w:after="0" w:line="252" w:lineRule="auto"/>
-              <w:jc w:val="left"/>
-            </w:pPr>
-            <w:r>
-              <w:rPr>
-                <w:sz w:val="15"/>
-              </w:rPr>
-              <w:t>3×5=15</w:t>
-            </w:r>
-          </w:p>
-        </w:tc>
-        <w:tc>
-          <w:tcPr>
-            <w:tcW w:w="3090" w:type="dxa"/>
-            <w:tcBorders>
-              <w:top w:val="single" w:sz="4" w:space="0" w:color="BABABA"/>
-              <w:left w:val="single" w:sz="4" w:space="0" w:color="BABABA"/>
-              <w:bottom w:val="single" w:sz="4" w:space="0" w:color="BABABA"/>
-              <w:right w:val="single" w:sz="4" w:space="0" w:color="BABABA"/>
-            </w:tcBorders>
-            <w:tcMar>
-              <w:top w:w="72" w:type="dxa"/>
-              <w:left w:w="70" w:type="dxa"/>
-              <w:bottom w:w="72" w:type="dxa"/>
-              <w:right w:w="65" w:type="dxa"/>
-            </w:tcMar>
-            <w:vAlign w:val="center"/>
-          </w:tcPr>
-          <w:p>
-            <w:pPr>
-              <w:spacing w:after="0" w:line="252" w:lineRule="auto"/>
-              <w:jc w:val="left"/>
-            </w:pPr>
-            <w:r>
-              <w:rPr>
-                <w:sz w:val="15"/>
-              </w:rPr>
-              <w:t>State assumptions and require operations review.</w:t>
-            </w:r>
-          </w:p>
-        </w:tc>
-        <w:tc>
-          <w:tcPr>
-            <w:tcW w:w="1247" w:type="dxa"/>
-            <w:tcBorders>
-              <w:top w:val="single" w:sz="4" w:space="0" w:color="BABABA"/>
-              <w:left w:val="single" w:sz="4" w:space="0" w:color="BABABA"/>
-              <w:bottom w:val="single" w:sz="4" w:space="0" w:color="BABABA"/>
-              <w:right w:val="single" w:sz="4" w:space="0" w:color="BABABA"/>
-            </w:tcBorders>
-            <w:tcMar>
-              <w:top w:w="72" w:type="dxa"/>
-              <w:left w:w="70" w:type="dxa"/>
-              <w:bottom w:w="72" w:type="dxa"/>
-              <w:right w:w="65" w:type="dxa"/>
-            </w:tcMar>
-            <w:vAlign w:val="center"/>
-          </w:tcPr>
-          <w:p>
-            <w:pPr>
-              <w:spacing w:after="0" w:line="252" w:lineRule="auto"/>
-              <w:jc w:val="left"/>
-            </w:pPr>
-            <w:r>
-              <w:rPr>
-                <w:sz w:val="15"/>
-              </w:rPr>
-              <w:t>1×5=5</w:t>
-            </w:r>
-          </w:p>
-        </w:tc>
-      </w:tr>
-      <w:tr>
-        <w:trPr>
-          <w:jc w:val="center"/>
-        </w:trPr>
-        <w:tc>
-          <w:tcPr>
-            <w:tcW w:w="1701" w:type="dxa"/>
-            <w:tcBorders>
-              <w:top w:val="single" w:sz="4" w:space="0" w:color="BABABA"/>
-              <w:left w:val="single" w:sz="4" w:space="0" w:color="BABABA"/>
-              <w:bottom w:val="single" w:sz="4" w:space="0" w:color="BABABA"/>
-              <w:right w:val="single" w:sz="4" w:space="0" w:color="BABABA"/>
-            </w:tcBorders>
-            <w:tcMar>
-              <w:top w:w="72" w:type="dxa"/>
-              <w:left w:w="70" w:type="dxa"/>
-              <w:bottom w:w="72" w:type="dxa"/>
-              <w:right w:w="65" w:type="dxa"/>
-            </w:tcMar>
-            <w:vAlign w:val="center"/>
-          </w:tcPr>
-          <w:p>
-            <w:pPr>
-              <w:spacing w:after="0" w:line="252" w:lineRule="auto"/>
-              <w:jc w:val="left"/>
-            </w:pPr>
-            <w:r>
-              <w:rPr>
-                <w:sz w:val="15"/>
-              </w:rPr>
-              <w:t>Shop-floor observation</w:t>
-            </w:r>
-          </w:p>
-        </w:tc>
-        <w:tc>
-          <w:tcPr>
-            <w:tcW w:w="1984" w:type="dxa"/>
-            <w:tcBorders>
-              <w:top w:val="single" w:sz="4" w:space="0" w:color="BABABA"/>
-              <w:left w:val="single" w:sz="4" w:space="0" w:color="BABABA"/>
-              <w:bottom w:val="single" w:sz="4" w:space="0" w:color="BABABA"/>
-              <w:right w:val="single" w:sz="4" w:space="0" w:color="BABABA"/>
-            </w:tcBorders>
-            <w:tcMar>
-              <w:top w:w="72" w:type="dxa"/>
-              <w:left w:w="70" w:type="dxa"/>
-              <w:bottom w:w="72" w:type="dxa"/>
-              <w:right w:w="65" w:type="dxa"/>
-            </w:tcMar>
-            <w:vAlign w:val="center"/>
-          </w:tcPr>
-          <w:p>
-            <w:pPr>
-              <w:spacing w:after="0" w:line="252" w:lineRule="auto"/>
-              <w:jc w:val="left"/>
-            </w:pPr>
-            <w:r>
-              <w:rPr>
-                <w:sz w:val="15"/>
-              </w:rPr>
-              <w:t>Exposure to moving parts and equipment.</w:t>
-            </w:r>
-          </w:p>
-        </w:tc>
-        <w:tc>
-          <w:tcPr>
-            <w:tcW w:w="1162" w:type="dxa"/>
-            <w:tcBorders>
-              <w:top w:val="single" w:sz="4" w:space="0" w:color="BABABA"/>
-              <w:left w:val="single" w:sz="4" w:space="0" w:color="BABABA"/>
-              <w:bottom w:val="single" w:sz="4" w:space="0" w:color="BABABA"/>
-              <w:right w:val="single" w:sz="4" w:space="0" w:color="BABABA"/>
-            </w:tcBorders>
-            <w:tcMar>
-              <w:top w:w="72" w:type="dxa"/>
-              <w:left w:w="70" w:type="dxa"/>
-              <w:bottom w:w="72" w:type="dxa"/>
-              <w:right w:w="65" w:type="dxa"/>
-            </w:tcMar>
-            <w:vAlign w:val="center"/>
-          </w:tcPr>
-          <w:p>
-            <w:pPr>
-              <w:spacing w:after="0" w:line="252" w:lineRule="auto"/>
-              <w:jc w:val="left"/>
-            </w:pPr>
-            <w:r>
-              <w:rPr>
-                <w:sz w:val="15"/>
-              </w:rPr>
-              <w:t>3×4=12</w:t>
-            </w:r>
-          </w:p>
-        </w:tc>
-        <w:tc>
-          <w:tcPr>
-            <w:tcW w:w="3090" w:type="dxa"/>
-            <w:tcBorders>
-              <w:top w:val="single" w:sz="4" w:space="0" w:color="BABABA"/>
-              <w:left w:val="single" w:sz="4" w:space="0" w:color="BABABA"/>
-              <w:bottom w:val="single" w:sz="4" w:space="0" w:color="BABABA"/>
-              <w:right w:val="single" w:sz="4" w:space="0" w:color="BABABA"/>
-            </w:tcBorders>
-            <w:tcMar>
-              <w:top w:w="72" w:type="dxa"/>
-              <w:left w:w="70" w:type="dxa"/>
-              <w:bottom w:w="72" w:type="dxa"/>
-              <w:right w:w="65" w:type="dxa"/>
-            </w:tcMar>
-            <w:vAlign w:val="center"/>
-          </w:tcPr>
-          <w:p>
-            <w:pPr>
-              <w:spacing w:after="0" w:line="252" w:lineRule="auto"/>
-              <w:jc w:val="left"/>
-            </w:pPr>
-            <w:r>
-              <w:rPr>
-                <w:sz w:val="15"/>
-              </w:rPr>
-              <w:t>Approval, PPE, safe zones and no disruption to work.</w:t>
-            </w:r>
-          </w:p>
-        </w:tc>
-        <w:tc>
-          <w:tcPr>
-            <w:tcW w:w="1247" w:type="dxa"/>
-            <w:tcBorders>
-              <w:top w:val="single" w:sz="4" w:space="0" w:color="BABABA"/>
-              <w:left w:val="single" w:sz="4" w:space="0" w:color="BABABA"/>
-              <w:bottom w:val="single" w:sz="4" w:space="0" w:color="BABABA"/>
-              <w:right w:val="single" w:sz="4" w:space="0" w:color="BABABA"/>
-            </w:tcBorders>
-            <w:tcMar>
-              <w:top w:w="72" w:type="dxa"/>
-              <w:left w:w="70" w:type="dxa"/>
-              <w:bottom w:w="72" w:type="dxa"/>
-              <w:right w:w="65" w:type="dxa"/>
-            </w:tcMar>
-            <w:vAlign w:val="center"/>
-          </w:tcPr>
-          <w:p>
-            <w:pPr>
-              <w:spacing w:after="0" w:line="252" w:lineRule="auto"/>
-              <w:jc w:val="left"/>
-            </w:pPr>
-            <w:r>
-              <w:rPr>
-                <w:sz w:val="15"/>
-              </w:rPr>
-              <w:t>1×4=4</w:t>
-            </w:r>
-          </w:p>
-        </w:tc>
-      </w:tr>
-      <w:tr>
-        <w:trPr>
-          <w:jc w:val="center"/>
-        </w:trPr>
-        <w:tc>
-          <w:tcPr>
-            <w:tcW w:w="1701" w:type="dxa"/>
-            <w:tcBorders>
-              <w:top w:val="single" w:sz="4" w:space="0" w:color="BABABA"/>
-              <w:left w:val="single" w:sz="4" w:space="0" w:color="BABABA"/>
-              <w:bottom w:val="single" w:sz="4" w:space="0" w:color="BABABA"/>
-              <w:right w:val="single" w:sz="4" w:space="0" w:color="BABABA"/>
-            </w:tcBorders>
-            <w:tcMar>
-              <w:top w:w="72" w:type="dxa"/>
-              <w:left w:w="70" w:type="dxa"/>
-              <w:bottom w:w="72" w:type="dxa"/>
-              <w:right w:w="65" w:type="dxa"/>
-            </w:tcMar>
-            <w:vAlign w:val="center"/>
-          </w:tcPr>
-          <w:p>
-            <w:pPr>
-              <w:spacing w:after="0" w:line="252" w:lineRule="auto"/>
-              <w:jc w:val="left"/>
-            </w:pPr>
-            <w:r>
-              <w:rPr>
-                <w:sz w:val="15"/>
-              </w:rPr>
-              <w:t>Scope expansion / project delay</w:t>
-            </w:r>
-          </w:p>
-        </w:tc>
-        <w:tc>
-          <w:tcPr>
-            <w:tcW w:w="1984" w:type="dxa"/>
-            <w:tcBorders>
-              <w:top w:val="single" w:sz="4" w:space="0" w:color="BABABA"/>
-              <w:left w:val="single" w:sz="4" w:space="0" w:color="BABABA"/>
-              <w:bottom w:val="single" w:sz="4" w:space="0" w:color="BABABA"/>
-              <w:right w:val="single" w:sz="4" w:space="0" w:color="BABABA"/>
-            </w:tcBorders>
-            <w:tcMar>
-              <w:top w:w="72" w:type="dxa"/>
-              <w:left w:w="70" w:type="dxa"/>
-              <w:bottom w:w="72" w:type="dxa"/>
-              <w:right w:w="65" w:type="dxa"/>
-            </w:tcMar>
-            <w:vAlign w:val="center"/>
-          </w:tcPr>
-          <w:p>
-            <w:pPr>
-              <w:spacing w:after="0" w:line="252" w:lineRule="auto"/>
-              <w:jc w:val="left"/>
-            </w:pPr>
-            <w:r>
-              <w:rPr>
-                <w:sz w:val="15"/>
-              </w:rPr>
-              <w:t>Key deliverables remain unfinished.</w:t>
-            </w:r>
-          </w:p>
-        </w:tc>
-        <w:tc>
-          <w:tcPr>
-            <w:tcW w:w="1162" w:type="dxa"/>
-            <w:tcBorders>
-              <w:top w:val="single" w:sz="4" w:space="0" w:color="BABABA"/>
-              <w:left w:val="single" w:sz="4" w:space="0" w:color="BABABA"/>
-              <w:bottom w:val="single" w:sz="4" w:space="0" w:color="BABABA"/>
-              <w:right w:val="single" w:sz="4" w:space="0" w:color="BABABA"/>
-            </w:tcBorders>
-            <w:tcMar>
-              <w:top w:w="72" w:type="dxa"/>
-              <w:left w:w="70" w:type="dxa"/>
-              <w:bottom w:w="72" w:type="dxa"/>
-              <w:right w:w="65" w:type="dxa"/>
-            </w:tcMar>
-            <w:vAlign w:val="center"/>
-          </w:tcPr>
-          <w:p>
-            <w:pPr>
-              <w:spacing w:after="0" w:line="252" w:lineRule="auto"/>
-              <w:jc w:val="left"/>
-            </w:pPr>
-            <w:r>
-              <w:rPr>
-                <w:sz w:val="15"/>
-              </w:rPr>
-              <w:t>4×3=12</w:t>
-            </w:r>
-          </w:p>
-        </w:tc>
-        <w:tc>
-          <w:tcPr>
-            <w:tcW w:w="3090" w:type="dxa"/>
-            <w:tcBorders>
-              <w:top w:val="single" w:sz="4" w:space="0" w:color="BABABA"/>
-              <w:left w:val="single" w:sz="4" w:space="0" w:color="BABABA"/>
-              <w:bottom w:val="single" w:sz="4" w:space="0" w:color="BABABA"/>
-              <w:right w:val="single" w:sz="4" w:space="0" w:color="BABABA"/>
-            </w:tcBorders>
-            <w:tcMar>
-              <w:top w:w="72" w:type="dxa"/>
-              <w:left w:w="70" w:type="dxa"/>
-              <w:bottom w:w="72" w:type="dxa"/>
-              <w:right w:w="65" w:type="dxa"/>
-            </w:tcMar>
-            <w:vAlign w:val="center"/>
-          </w:tcPr>
-          <w:p>
-            <w:pPr>
-              <w:spacing w:after="0" w:line="252" w:lineRule="auto"/>
-              <w:jc w:val="left"/>
-            </w:pPr>
-            <w:r>
-              <w:rPr>
-                <w:sz w:val="15"/>
-              </w:rPr>
-              <w:t>Prioritise core functions, use milestones and Git.</w:t>
-            </w:r>
-          </w:p>
-        </w:tc>
-        <w:tc>
-          <w:tcPr>
-            <w:tcW w:w="1247" w:type="dxa"/>
-            <w:tcBorders>
-              <w:top w:val="single" w:sz="4" w:space="0" w:color="BABABA"/>
-              <w:left w:val="single" w:sz="4" w:space="0" w:color="BABABA"/>
-              <w:bottom w:val="single" w:sz="4" w:space="0" w:color="BABABA"/>
-              <w:right w:val="single" w:sz="4" w:space="0" w:color="BABABA"/>
-            </w:tcBorders>
-            <w:tcMar>
-              <w:top w:w="72" w:type="dxa"/>
-              <w:left w:w="70" w:type="dxa"/>
-              <w:bottom w:w="72" w:type="dxa"/>
-              <w:right w:w="65" w:type="dxa"/>
-            </w:tcMar>
-            <w:vAlign w:val="center"/>
-          </w:tcPr>
-          <w:p>
-            <w:pPr>
-              <w:spacing w:after="0" w:line="252" w:lineRule="auto"/>
-              <w:jc w:val="left"/>
-            </w:pPr>
-            <w:r>
-              <w:rPr>
-                <w:sz w:val="15"/>
-              </w:rPr>
-              <w:t>2×3=6</w:t>
-            </w:r>
-          </w:p>
-        </w:tc>
-      </w:tr>
-      <w:tr>
-        <w:trPr>
-          <w:jc w:val="center"/>
-        </w:trPr>
-        <w:tc>
-          <w:tcPr>
-            <w:tcW w:w="1701" w:type="dxa"/>
-            <w:tcBorders>
-              <w:top w:val="single" w:sz="4" w:space="0" w:color="BABABA"/>
-              <w:left w:val="single" w:sz="4" w:space="0" w:color="BABABA"/>
-              <w:bottom w:val="single" w:sz="4" w:space="0" w:color="BABABA"/>
-              <w:right w:val="single" w:sz="4" w:space="0" w:color="BABABA"/>
-            </w:tcBorders>
-            <w:tcMar>
-              <w:top w:w="72" w:type="dxa"/>
-              <w:left w:w="70" w:type="dxa"/>
-              <w:bottom w:w="72" w:type="dxa"/>
-              <w:right w:w="65" w:type="dxa"/>
-            </w:tcMar>
-            <w:vAlign w:val="center"/>
-          </w:tcPr>
-          <w:p>
-            <w:pPr>
-              <w:spacing w:after="0" w:line="252" w:lineRule="auto"/>
-              <w:jc w:val="left"/>
-            </w:pPr>
-            <w:r>
-              <w:rPr>
-                <w:sz w:val="15"/>
-              </w:rPr>
-              <w:t>Extended computer use</w:t>
-            </w:r>
-          </w:p>
-        </w:tc>
-        <w:tc>
-          <w:tcPr>
-            <w:tcW w:w="1984" w:type="dxa"/>
-            <w:tcBorders>
-              <w:top w:val="single" w:sz="4" w:space="0" w:color="BABABA"/>
-              <w:left w:val="single" w:sz="4" w:space="0" w:color="BABABA"/>
-              <w:bottom w:val="single" w:sz="4" w:space="0" w:color="BABABA"/>
-              <w:right w:val="single" w:sz="4" w:space="0" w:color="BABABA"/>
-            </w:tcBorders>
-            <w:tcMar>
-              <w:top w:w="72" w:type="dxa"/>
-              <w:left w:w="70" w:type="dxa"/>
-              <w:bottom w:w="72" w:type="dxa"/>
-              <w:right w:w="65" w:type="dxa"/>
-            </w:tcMar>
-            <w:vAlign w:val="center"/>
-          </w:tcPr>
-          <w:p>
-            <w:pPr>
-              <w:spacing w:after="0" w:line="252" w:lineRule="auto"/>
-              <w:jc w:val="left"/>
-            </w:pPr>
-            <w:r>
-              <w:rPr>
-                <w:sz w:val="15"/>
-              </w:rPr>
-              <w:t>Eyestrain or musculoskeletal discomfort.</w:t>
-            </w:r>
-          </w:p>
-        </w:tc>
-        <w:tc>
-          <w:tcPr>
-            <w:tcW w:w="1162" w:type="dxa"/>
-            <w:tcBorders>
-              <w:top w:val="single" w:sz="4" w:space="0" w:color="BABABA"/>
-              <w:left w:val="single" w:sz="4" w:space="0" w:color="BABABA"/>
-              <w:bottom w:val="single" w:sz="4" w:space="0" w:color="BABABA"/>
-              <w:right w:val="single" w:sz="4" w:space="0" w:color="BABABA"/>
-            </w:tcBorders>
-            <w:tcMar>
-              <w:top w:w="72" w:type="dxa"/>
-              <w:left w:w="70" w:type="dxa"/>
-              <w:bottom w:w="72" w:type="dxa"/>
-              <w:right w:w="65" w:type="dxa"/>
-            </w:tcMar>
-            <w:vAlign w:val="center"/>
-          </w:tcPr>
-          <w:p>
-            <w:pPr>
-              <w:spacing w:after="0" w:line="252" w:lineRule="auto"/>
-              <w:jc w:val="left"/>
-            </w:pPr>
-            <w:r>
-              <w:rPr>
-                <w:sz w:val="15"/>
-              </w:rPr>
-              <w:t>3×2=6</w:t>
-            </w:r>
-          </w:p>
-        </w:tc>
-        <w:tc>
-          <w:tcPr>
-            <w:tcW w:w="3090" w:type="dxa"/>
-            <w:tcBorders>
-              <w:top w:val="single" w:sz="4" w:space="0" w:color="BABABA"/>
-              <w:left w:val="single" w:sz="4" w:space="0" w:color="BABABA"/>
-              <w:bottom w:val="single" w:sz="4" w:space="0" w:color="BABABA"/>
-              <w:right w:val="single" w:sz="4" w:space="0" w:color="BABABA"/>
-            </w:tcBorders>
-            <w:tcMar>
-              <w:top w:w="72" w:type="dxa"/>
-              <w:left w:w="70" w:type="dxa"/>
-              <w:bottom w:w="72" w:type="dxa"/>
-              <w:right w:w="65" w:type="dxa"/>
-            </w:tcMar>
-            <w:vAlign w:val="center"/>
-          </w:tcPr>
-          <w:p>
-            <w:pPr>
-              <w:spacing w:after="0" w:line="252" w:lineRule="auto"/>
-              <w:jc w:val="left"/>
-            </w:pPr>
-            <w:r>
-              <w:rPr>
-                <w:sz w:val="15"/>
-              </w:rPr>
-              <w:t>Ergonomic setup and regular breaks.</w:t>
-            </w:r>
-          </w:p>
-        </w:tc>
-        <w:tc>
-          <w:tcPr>
-            <w:tcW w:w="1247" w:type="dxa"/>
-            <w:tcBorders>
-              <w:top w:val="single" w:sz="4" w:space="0" w:color="BABABA"/>
-              <w:left w:val="single" w:sz="4" w:space="0" w:color="BABABA"/>
-              <w:bottom w:val="single" w:sz="4" w:space="0" w:color="BABABA"/>
-              <w:right w:val="single" w:sz="4" w:space="0" w:color="BABABA"/>
-            </w:tcBorders>
-            <w:tcMar>
-              <w:top w:w="72" w:type="dxa"/>
-              <w:left w:w="70" w:type="dxa"/>
-              <w:bottom w:w="72" w:type="dxa"/>
-              <w:right w:w="65" w:type="dxa"/>
-            </w:tcMar>
-            <w:vAlign w:val="center"/>
-          </w:tcPr>
-          <w:p>
-            <w:pPr>
-              <w:spacing w:after="0" w:line="252" w:lineRule="auto"/>
-              <w:jc w:val="left"/>
-            </w:pPr>
-            <w:r>
-              <w:rPr>
-                <w:sz w:val="15"/>
-              </w:rPr>
-              <w:t>1×2=2</w:t>
+              <w:t>)</w:t>
             </w:r>
           </w:p>
         </w:tc>
       </w:tr>
     </w:tbl>
-    <w:p>
-      <w:pPr>
-        <w:keepLines/>
-        <w:spacing w:line="269" w:lineRule="auto"/>
-      </w:pPr>
-      <w:r>
-        <w:rPr>
-          <w:i/>
-          <w:sz w:val="18"/>
-        </w:rPr>
-        <w:t>These are preliminary engineering estimates, not workplace-approved risk ratings. Likelihood and severity will be reviewed when the actual data collection tasks are confirmed.</w:t>
-      </w:r>
-    </w:p>
     <w:p>
       <w:pPr>
         <w:pStyle w:val="Heading2"/>
@@ -6856,7 +6392,21 @@
           <w:rFonts w:ascii="Arial" w:hAnsi="Arial"/>
           <w:sz w:val="21"/>
         </w:rPr>
-        <w:t>Key risk priorities</w:t>
+        <w:t>Technical an</w:t>
+      </w:r>
+      <w:r>
+        <w:rPr>
+          <w:rFonts w:ascii="Arial" w:hAnsi="Arial"/>
+          <w:sz w:val="21"/>
+        </w:rPr>
+        <w:t>d</w:t>
+      </w:r>
+      <w:r>
+        <w:rPr>
+          <w:rFonts w:ascii="Arial" w:hAnsi="Arial"/>
+          <w:sz w:val="21"/>
+        </w:rPr>
+        <w:t xml:space="preserve"> project-related risks</w:t>
       </w:r>
     </w:p>
     <w:p>
@@ -6865,15 +6415,11 @@
         <w:spacing w:line="269" w:lineRule="auto"/>
       </w:pPr>
       <w:r>
-        <w:t>I consider the accuracy of the simulation and the risk of over-trusting its output to be the most important technical issues. A layout may look efficient in the program but still be unsuitable because of operator access, inspection requirements or equipment restrictions. For this reason, the tool will be presented as a way to prepare for validation, not as a replacement for an engineering decision.</w:t>
+        <w:t>The</w:t>
       </w:r>
-    </w:p>
-    <w:p>
-      <w:pPr>
-        <w:keepLines/>
-        <w:spacing w:line="269" w:lineRule="auto"/>
-        <w:ind w:firstLine="369"/>
-      </w:pPr>
+      <w:r>
+        <w:t xml:space="preserve"> need to manage incorrect cycle times, programming errors, confidentiality and delays from expanding the software scope. These concerns may reduce the quality of my results, but they are not direct WSH hazards for a pre-validation tool. I will check input data against available standard work, test calculations against known examples, keep company information in approved storage and review the outputs with engineers or operators before drawing conclusions. No simulation result will be treated as approval to change an actual line.</w:t>
+      </w:r>
       <w:r>
         <w:br w:type="page"/>
       </w:r>
@@ -7352,7 +6898,15 @@
         <w:spacing w:line="269" w:lineRule="auto"/>
       </w:pPr>
       <w:r>
-        <w:t>The evaluation will report both the improvements and limitations observed. If there is not enough reliable data to validate a certain behaviour, I will identify it as an assumption rather than present the result as proven.</w:t>
+        <w:t xml:space="preserve">The evaluation will </w:t>
+      </w:r>
+      <w:proofErr w:type="gramStart"/>
+      <w:r>
+        <w:t>report</w:t>
+      </w:r>
+      <w:proofErr w:type="gramEnd"/>
+      <w:r>
+        <w:t xml:space="preserve"> both the improvements and limitations observed. If there is not enough reliable data to validate a certain behaviour, I will identify it as an assumption rather than present the result as proven.</w:t>
       </w:r>
     </w:p>
     <w:p>
@@ -7474,7 +7028,23 @@
         <w:color w:val="586570"/>
         <w:sz w:val="14"/>
       </w:rPr>
-      <w:t>GEVSS industrial context  •  October 2026</w:t>
+      <w:t xml:space="preserve">GEVSS industrial </w:t>
+    </w:r>
+    <w:proofErr w:type="gramStart"/>
+    <w:r>
+      <w:rPr>
+        <w:color w:val="586570"/>
+        <w:sz w:val="14"/>
+      </w:rPr>
+      <w:t>context  •</w:t>
+    </w:r>
+    <w:proofErr w:type="gramEnd"/>
+    <w:r>
+      <w:rPr>
+        <w:color w:val="586570"/>
+        <w:sz w:val="14"/>
+      </w:rPr>
+      <w:t xml:space="preserve">  October 2026</w:t>
     </w:r>
   </w:p>
 </w:ftr>
@@ -8394,7 +7964,6 @@
   <w:style w:type="character" w:default="1" w:styleId="DefaultParagraphFont">
     <w:name w:val="Default Paragraph Font"/>
     <w:uiPriority w:val="1"/>
-    <w:semiHidden/>
     <w:unhideWhenUsed/>
   </w:style>
   <w:style w:type="table" w:default="1" w:styleId="TableNormal">

</xml_diff>